<commit_message>
Continue the Mr. Robots challenge
</commit_message>
<xml_diff>
--- a/THM_challenges/Medium/Mr Robot CTF/Mr Robot CTF_Solution_Documentation.docx
+++ b/THM_challenges/Medium/Mr Robot CTF/Mr Robot CTF_Solution_Documentation.docx
@@ -21,17 +21,7 @@
           <w:szCs w:val="32"/>
           <w:u w:val="single"/>
         </w:rPr>
-        <w:t>Mr Robot CTF</w:t>
-      </w:r>
-      <w:r>
-        <w:rPr>
-          <w:b/>
-          <w:bCs/>
-          <w:sz w:val="32"/>
-          <w:szCs w:val="32"/>
-          <w:u w:val="single"/>
-        </w:rPr>
-        <w:t>_Solution_Documentation</w:t>
+        <w:t>Mr Robot CTF_Solution_Documentation</w:t>
       </w:r>
     </w:p>
     <w:p>
@@ -80,6 +70,7 @@
       </w:pPr>
       <w:r>
         <w:rPr>
+          <w:noProof/>
           <w:sz w:val="26"/>
           <w:szCs w:val="26"/>
         </w:rPr>
@@ -250,6 +241,7 @@
       </w:pPr>
       <w:r>
         <w:rPr>
+          <w:noProof/>
           <w:sz w:val="26"/>
           <w:szCs w:val="26"/>
         </w:rPr>
@@ -302,7 +294,1610 @@
           <w:sz w:val="26"/>
           <w:szCs w:val="26"/>
         </w:rPr>
-        <w:t xml:space="preserve">I read the text and </w:t>
+        <w:t xml:space="preserve">I read the </w:t>
+      </w:r>
+      <w:r>
+        <w:rPr>
+          <w:sz w:val="26"/>
+          <w:szCs w:val="26"/>
+        </w:rPr>
+        <w:t xml:space="preserve">message on </w:t>
+      </w:r>
+      <w:r>
+        <w:rPr>
+          <w:sz w:val="26"/>
+          <w:szCs w:val="26"/>
+        </w:rPr>
+        <w:t>top,</w:t>
+      </w:r>
+      <w:r>
+        <w:rPr>
+          <w:sz w:val="26"/>
+          <w:szCs w:val="26"/>
+        </w:rPr>
+        <w:t xml:space="preserve"> and I </w:t>
+      </w:r>
+      <w:r>
+        <w:rPr>
+          <w:sz w:val="26"/>
+          <w:szCs w:val="26"/>
+        </w:rPr>
+        <w:t>tried each of the available commands:</w:t>
+      </w:r>
+    </w:p>
+    <w:p>
+      <w:pPr>
+        <w:rPr>
+          <w:sz w:val="26"/>
+          <w:szCs w:val="26"/>
+        </w:rPr>
+      </w:pPr>
+    </w:p>
+    <w:p>
+      <w:pPr>
+        <w:rPr>
+          <w:sz w:val="26"/>
+          <w:szCs w:val="26"/>
+        </w:rPr>
+      </w:pPr>
+    </w:p>
+    <w:p>
+      <w:pPr>
+        <w:rPr>
+          <w:b/>
+          <w:bCs/>
+          <w:sz w:val="26"/>
+          <w:szCs w:val="26"/>
+          <w:u w:val="single"/>
+        </w:rPr>
+      </w:pPr>
+      <w:r>
+        <w:rPr>
+          <w:b/>
+          <w:bCs/>
+          <w:sz w:val="26"/>
+          <w:szCs w:val="26"/>
+          <w:u w:val="single"/>
+        </w:rPr>
+        <w:lastRenderedPageBreak/>
+        <w:t>Prepare:</w:t>
+      </w:r>
+    </w:p>
+    <w:p>
+      <w:pPr>
+        <w:rPr>
+          <w:sz w:val="26"/>
+          <w:szCs w:val="26"/>
+        </w:rPr>
+      </w:pPr>
+      <w:r>
+        <w:rPr>
+          <w:sz w:val="26"/>
+          <w:szCs w:val="26"/>
+        </w:rPr>
+        <w:t>This command led me to a video from the tv-show Mr. Robot that this CTF is based on</w:t>
+      </w:r>
+      <w:r>
+        <w:rPr>
+          <w:sz w:val="26"/>
+          <w:szCs w:val="26"/>
+        </w:rPr>
+        <w:t>.</w:t>
+      </w:r>
+    </w:p>
+    <w:p>
+      <w:pPr>
+        <w:rPr>
+          <w:b/>
+          <w:bCs/>
+          <w:sz w:val="26"/>
+          <w:szCs w:val="26"/>
+          <w:u w:val="single"/>
+        </w:rPr>
+      </w:pPr>
+      <w:r>
+        <w:rPr>
+          <w:b/>
+          <w:bCs/>
+          <w:sz w:val="26"/>
+          <w:szCs w:val="26"/>
+          <w:u w:val="single"/>
+        </w:rPr>
+        <w:t>Fsociety:</w:t>
+      </w:r>
+    </w:p>
+    <w:p>
+      <w:pPr>
+        <w:rPr>
+          <w:sz w:val="26"/>
+          <w:szCs w:val="26"/>
+        </w:rPr>
+      </w:pPr>
+      <w:r>
+        <w:rPr>
+          <w:sz w:val="26"/>
+          <w:szCs w:val="26"/>
+        </w:rPr>
+        <w:t xml:space="preserve">This command led me to a short video which the text “Are you ready to join </w:t>
+      </w:r>
+      <w:r>
+        <w:rPr>
+          <w:sz w:val="26"/>
+          <w:szCs w:val="26"/>
+        </w:rPr>
+        <w:t>fsociety</w:t>
+      </w:r>
+      <w:r>
+        <w:rPr>
+          <w:sz w:val="26"/>
+          <w:szCs w:val="26"/>
+        </w:rPr>
+        <w:t>?”</w:t>
+      </w:r>
+      <w:r>
+        <w:rPr>
+          <w:sz w:val="26"/>
+          <w:szCs w:val="26"/>
+        </w:rPr>
+        <w:t>.</w:t>
+      </w:r>
+    </w:p>
+    <w:p>
+      <w:pPr>
+        <w:rPr>
+          <w:b/>
+          <w:bCs/>
+          <w:sz w:val="26"/>
+          <w:szCs w:val="26"/>
+          <w:u w:val="single"/>
+        </w:rPr>
+      </w:pPr>
+      <w:r>
+        <w:rPr>
+          <w:b/>
+          <w:bCs/>
+          <w:sz w:val="26"/>
+          <w:szCs w:val="26"/>
+          <w:u w:val="single"/>
+        </w:rPr>
+        <w:t>Inform:</w:t>
+      </w:r>
+    </w:p>
+    <w:p>
+      <w:pPr>
+        <w:rPr>
+          <w:sz w:val="26"/>
+          <w:szCs w:val="26"/>
+        </w:rPr>
+      </w:pPr>
+      <w:r>
+        <w:rPr>
+          <w:sz w:val="26"/>
+          <w:szCs w:val="26"/>
+        </w:rPr>
+        <w:t xml:space="preserve">The command </w:t>
+      </w:r>
+      <w:r>
+        <w:rPr>
+          <w:sz w:val="26"/>
+          <w:szCs w:val="26"/>
+        </w:rPr>
+        <w:t xml:space="preserve">led me to 4 newspaper </w:t>
+      </w:r>
+      <w:r>
+        <w:rPr>
+          <w:sz w:val="26"/>
+          <w:szCs w:val="26"/>
+        </w:rPr>
+        <w:t xml:space="preserve">reports which talks about different kind of subject which all connects to </w:t>
+      </w:r>
+      <w:r>
+        <w:rPr>
+          <w:sz w:val="26"/>
+          <w:szCs w:val="26"/>
+        </w:rPr>
+        <w:t xml:space="preserve">power and control </w:t>
+      </w:r>
+      <w:r>
+        <w:rPr>
+          <w:sz w:val="26"/>
+          <w:szCs w:val="26"/>
+        </w:rPr>
+        <w:t>over the world by rich people, a thing that hated among the “fsociety” members.</w:t>
+      </w:r>
+    </w:p>
+    <w:p>
+      <w:pPr>
+        <w:rPr>
+          <w:b/>
+          <w:bCs/>
+          <w:sz w:val="26"/>
+          <w:szCs w:val="26"/>
+          <w:u w:val="single"/>
+        </w:rPr>
+      </w:pPr>
+      <w:r>
+        <w:rPr>
+          <w:b/>
+          <w:bCs/>
+          <w:sz w:val="26"/>
+          <w:szCs w:val="26"/>
+          <w:u w:val="single"/>
+        </w:rPr>
+        <w:t>Question:</w:t>
+      </w:r>
+    </w:p>
+    <w:p>
+      <w:pPr>
+        <w:rPr>
+          <w:sz w:val="26"/>
+          <w:szCs w:val="26"/>
+        </w:rPr>
+      </w:pPr>
+      <w:r>
+        <w:rPr>
+          <w:sz w:val="26"/>
+          <w:szCs w:val="26"/>
+        </w:rPr>
+        <w:t xml:space="preserve">This command led me </w:t>
+      </w:r>
+      <w:r>
+        <w:rPr>
+          <w:sz w:val="26"/>
+          <w:szCs w:val="26"/>
+        </w:rPr>
+        <w:t xml:space="preserve">to 4 images which </w:t>
+      </w:r>
+      <w:r>
+        <w:rPr>
+          <w:sz w:val="26"/>
+          <w:szCs w:val="26"/>
+        </w:rPr>
+        <w:t>show</w:t>
+      </w:r>
+      <w:r>
+        <w:rPr>
+          <w:sz w:val="26"/>
+          <w:szCs w:val="26"/>
+        </w:rPr>
+        <w:t xml:space="preserve"> </w:t>
+      </w:r>
+      <w:r>
+        <w:rPr>
+          <w:sz w:val="26"/>
+          <w:szCs w:val="26"/>
+        </w:rPr>
+        <w:t xml:space="preserve">statements of several important people which reveals their </w:t>
+      </w:r>
+      <w:r>
+        <w:rPr>
+          <w:sz w:val="26"/>
+          <w:szCs w:val="26"/>
+        </w:rPr>
+        <w:t>true form</w:t>
+      </w:r>
+      <w:r>
+        <w:rPr>
+          <w:sz w:val="26"/>
+          <w:szCs w:val="26"/>
+        </w:rPr>
+        <w:t xml:space="preserve"> of themselves.</w:t>
+      </w:r>
+    </w:p>
+    <w:p>
+      <w:pPr>
+        <w:rPr>
+          <w:b/>
+          <w:bCs/>
+          <w:sz w:val="26"/>
+          <w:szCs w:val="26"/>
+          <w:u w:val="single"/>
+        </w:rPr>
+      </w:pPr>
+      <w:r>
+        <w:rPr>
+          <w:b/>
+          <w:bCs/>
+          <w:sz w:val="26"/>
+          <w:szCs w:val="26"/>
+          <w:u w:val="single"/>
+        </w:rPr>
+        <w:t>Wakeup:</w:t>
+      </w:r>
+    </w:p>
+    <w:p>
+      <w:pPr>
+        <w:rPr>
+          <w:sz w:val="26"/>
+          <w:szCs w:val="26"/>
+        </w:rPr>
+      </w:pPr>
+      <w:r>
+        <w:rPr>
+          <w:sz w:val="26"/>
+          <w:szCs w:val="26"/>
+        </w:rPr>
+        <w:t>This command led me to another short video fro</w:t>
+      </w:r>
+      <w:r>
+        <w:rPr>
+          <w:sz w:val="26"/>
+          <w:szCs w:val="26"/>
+        </w:rPr>
+        <w:t>m</w:t>
+      </w:r>
+      <w:r>
+        <w:rPr>
+          <w:sz w:val="26"/>
+          <w:szCs w:val="26"/>
+        </w:rPr>
+        <w:t xml:space="preserve"> Mr. Robot TV show.</w:t>
+      </w:r>
+    </w:p>
+    <w:p>
+      <w:pPr>
+        <w:rPr>
+          <w:b/>
+          <w:bCs/>
+          <w:sz w:val="26"/>
+          <w:szCs w:val="26"/>
+          <w:u w:val="single"/>
+        </w:rPr>
+      </w:pPr>
+      <w:r>
+        <w:rPr>
+          <w:b/>
+          <w:bCs/>
+          <w:sz w:val="26"/>
+          <w:szCs w:val="26"/>
+          <w:u w:val="single"/>
+        </w:rPr>
+        <w:t>Join:</w:t>
+      </w:r>
+    </w:p>
+    <w:p>
+      <w:pPr>
+        <w:rPr>
+          <w:sz w:val="26"/>
+          <w:szCs w:val="26"/>
+        </w:rPr>
+      </w:pPr>
+      <w:r>
+        <w:rPr>
+          <w:sz w:val="26"/>
+          <w:szCs w:val="26"/>
+        </w:rPr>
+        <w:t>The last command loaded up this message and waited until I enter my email:</w:t>
+      </w:r>
+    </w:p>
+    <w:p>
+      <w:pPr>
+        <w:rPr>
+          <w:sz w:val="26"/>
+          <w:szCs w:val="26"/>
+        </w:rPr>
+      </w:pPr>
+      <w:r>
+        <w:rPr>
+          <w:noProof/>
+          <w:sz w:val="26"/>
+          <w:szCs w:val="26"/>
+        </w:rPr>
+        <w:drawing>
+          <wp:inline distT="0" distB="0" distL="0" distR="0" wp14:anchorId="226D5C95" wp14:editId="2999DA20">
+            <wp:extent cx="7556500" cy="749300"/>
+            <wp:effectExtent l="0" t="0" r="6350" b="0"/>
+            <wp:docPr id="2099334339" name="תמונה 1"/>
+            <wp:cNvGraphicFramePr>
+              <a:graphicFrameLocks xmlns:a="http://schemas.openxmlformats.org/drawingml/2006/main" noChangeAspect="1"/>
+            </wp:cNvGraphicFramePr>
+            <a:graphic xmlns:a="http://schemas.openxmlformats.org/drawingml/2006/main">
+              <a:graphicData uri="http://schemas.openxmlformats.org/drawingml/2006/picture">
+                <pic:pic xmlns:pic="http://schemas.openxmlformats.org/drawingml/2006/picture">
+                  <pic:nvPicPr>
+                    <pic:cNvPr id="2099334339" name=""/>
+                    <pic:cNvPicPr/>
+                  </pic:nvPicPr>
+                  <pic:blipFill>
+                    <a:blip r:embed="rId6"/>
+                    <a:stretch>
+                      <a:fillRect/>
+                    </a:stretch>
+                  </pic:blipFill>
+                  <pic:spPr>
+                    <a:xfrm>
+                      <a:off x="0" y="0"/>
+                      <a:ext cx="7556500" cy="749300"/>
+                    </a:xfrm>
+                    <a:prstGeom prst="rect">
+                      <a:avLst/>
+                    </a:prstGeom>
+                  </pic:spPr>
+                </pic:pic>
+              </a:graphicData>
+            </a:graphic>
+          </wp:inline>
+        </w:drawing>
+      </w:r>
+    </w:p>
+    <w:p>
+      <w:pPr>
+        <w:rPr>
+          <w:sz w:val="26"/>
+          <w:szCs w:val="26"/>
+        </w:rPr>
+      </w:pPr>
+      <w:r>
+        <w:rPr>
+          <w:sz w:val="26"/>
+          <w:szCs w:val="26"/>
+        </w:rPr>
+        <w:t>I enter this email</w:t>
+      </w:r>
+      <w:r>
+        <w:rPr>
+          <w:sz w:val="26"/>
+          <w:szCs w:val="26"/>
+        </w:rPr>
+        <w:t>: “test@gmail.com”</w:t>
+      </w:r>
+      <w:r>
+        <w:rPr>
+          <w:sz w:val="26"/>
+          <w:szCs w:val="26"/>
+        </w:rPr>
+        <w:t xml:space="preserve"> to test the results</w:t>
+      </w:r>
+      <w:r>
+        <w:rPr>
+          <w:sz w:val="26"/>
+          <w:szCs w:val="26"/>
+        </w:rPr>
+        <w:t>:</w:t>
+      </w:r>
+    </w:p>
+    <w:p>
+      <w:pPr>
+        <w:rPr>
+          <w:sz w:val="26"/>
+          <w:szCs w:val="26"/>
+        </w:rPr>
+      </w:pPr>
+      <w:r>
+        <w:rPr>
+          <w:sz w:val="26"/>
+          <w:szCs w:val="26"/>
+        </w:rPr>
+        <w:t xml:space="preserve">And after clicking “Enter” it just wrote “We will be in touch” and it </w:t>
+      </w:r>
+      <w:r>
+        <w:rPr>
+          <w:sz w:val="26"/>
+          <w:szCs w:val="26"/>
+        </w:rPr>
+        <w:t>came back to the home page.</w:t>
+      </w:r>
+    </w:p>
+    <w:p>
+      <w:pPr>
+        <w:rPr>
+          <w:sz w:val="26"/>
+          <w:szCs w:val="26"/>
+        </w:rPr>
+      </w:pPr>
+      <w:r>
+        <w:rPr>
+          <w:sz w:val="26"/>
+          <w:szCs w:val="26"/>
+        </w:rPr>
+        <w:t>At this point</w:t>
+      </w:r>
+      <w:r>
+        <w:rPr>
+          <w:sz w:val="26"/>
+          <w:szCs w:val="26"/>
+        </w:rPr>
+        <w:t xml:space="preserve">, I </w:t>
+      </w:r>
+      <w:r>
+        <w:rPr>
+          <w:sz w:val="26"/>
+          <w:szCs w:val="26"/>
+        </w:rPr>
+        <w:t>looked at</w:t>
+      </w:r>
+      <w:r>
+        <w:rPr>
+          <w:sz w:val="26"/>
+          <w:szCs w:val="26"/>
+        </w:rPr>
+        <w:t xml:space="preserve"> the inspector</w:t>
+      </w:r>
+      <w:r>
+        <w:rPr>
+          <w:sz w:val="26"/>
+          <w:szCs w:val="26"/>
+        </w:rPr>
+        <w:t xml:space="preserve"> and found nothing relevant. Afterwards, I moved to see the content of robots.txt (because of the related “Mr. Robot”) and I found thing:</w:t>
+      </w:r>
+    </w:p>
+    <w:p>
+      <w:pPr>
+        <w:rPr>
+          <w:sz w:val="26"/>
+          <w:szCs w:val="26"/>
+        </w:rPr>
+      </w:pPr>
+      <w:r>
+        <w:rPr>
+          <w:noProof/>
+        </w:rPr>
+        <w:drawing>
+          <wp:inline distT="0" distB="0" distL="0" distR="0" wp14:anchorId="4749C203" wp14:editId="64619D85">
+            <wp:extent cx="2997200" cy="1449234"/>
+            <wp:effectExtent l="0" t="0" r="0" b="0"/>
+            <wp:docPr id="610462954" name="תמונה 1"/>
+            <wp:cNvGraphicFramePr>
+              <a:graphicFrameLocks xmlns:a="http://schemas.openxmlformats.org/drawingml/2006/main" noChangeAspect="1"/>
+            </wp:cNvGraphicFramePr>
+            <a:graphic xmlns:a="http://schemas.openxmlformats.org/drawingml/2006/main">
+              <a:graphicData uri="http://schemas.openxmlformats.org/drawingml/2006/picture">
+                <pic:pic xmlns:pic="http://schemas.openxmlformats.org/drawingml/2006/picture">
+                  <pic:nvPicPr>
+                    <pic:cNvPr id="610462954" name=""/>
+                    <pic:cNvPicPr/>
+                  </pic:nvPicPr>
+                  <pic:blipFill>
+                    <a:blip r:embed="rId7"/>
+                    <a:stretch>
+                      <a:fillRect/>
+                    </a:stretch>
+                  </pic:blipFill>
+                  <pic:spPr>
+                    <a:xfrm>
+                      <a:off x="0" y="0"/>
+                      <a:ext cx="3010378" cy="1455606"/>
+                    </a:xfrm>
+                    <a:prstGeom prst="rect">
+                      <a:avLst/>
+                    </a:prstGeom>
+                  </pic:spPr>
+                </pic:pic>
+              </a:graphicData>
+            </a:graphic>
+          </wp:inline>
+        </w:drawing>
+      </w:r>
+    </w:p>
+    <w:p>
+      <w:pPr>
+        <w:rPr>
+          <w:sz w:val="26"/>
+          <w:szCs w:val="26"/>
+        </w:rPr>
+      </w:pPr>
+      <w:r>
+        <w:rPr>
+          <w:sz w:val="26"/>
+          <w:szCs w:val="26"/>
+        </w:rPr>
+        <w:t>Immediately, I saw the “key-1-of-3.txt” file and opened it up. It’s content of course contained the first key of this challenge:</w:t>
+      </w:r>
+    </w:p>
+    <w:p>
+      <w:pPr>
+        <w:rPr>
+          <w:sz w:val="26"/>
+          <w:szCs w:val="26"/>
+        </w:rPr>
+      </w:pPr>
+      <w:r>
+        <w:rPr>
+          <w:noProof/>
+          <w:sz w:val="26"/>
+          <w:szCs w:val="26"/>
+        </w:rPr>
+        <w:drawing>
+          <wp:inline distT="0" distB="0" distL="0" distR="0" wp14:anchorId="51E4B7CE" wp14:editId="275DAD27">
+            <wp:extent cx="3600762" cy="800169"/>
+            <wp:effectExtent l="0" t="0" r="0" b="0"/>
+            <wp:docPr id="619154337" name="תמונה 1" descr="תמונה שמכילה טקסט, צילום מסך, גופן&#10;&#10;תוכן בינה מלאכותית גנרטיבית עשוי להיות שגוי."/>
+            <wp:cNvGraphicFramePr>
+              <a:graphicFrameLocks xmlns:a="http://schemas.openxmlformats.org/drawingml/2006/main" noChangeAspect="1"/>
+            </wp:cNvGraphicFramePr>
+            <a:graphic xmlns:a="http://schemas.openxmlformats.org/drawingml/2006/main">
+              <a:graphicData uri="http://schemas.openxmlformats.org/drawingml/2006/picture">
+                <pic:pic xmlns:pic="http://schemas.openxmlformats.org/drawingml/2006/picture">
+                  <pic:nvPicPr>
+                    <pic:cNvPr id="619154337" name="תמונה 1" descr="תמונה שמכילה טקסט, צילום מסך, גופן&#10;&#10;תוכן בינה מלאכותית גנרטיבית עשוי להיות שגוי."/>
+                    <pic:cNvPicPr/>
+                  </pic:nvPicPr>
+                  <pic:blipFill>
+                    <a:blip r:embed="rId8"/>
+                    <a:stretch>
+                      <a:fillRect/>
+                    </a:stretch>
+                  </pic:blipFill>
+                  <pic:spPr>
+                    <a:xfrm>
+                      <a:off x="0" y="0"/>
+                      <a:ext cx="3600762" cy="800169"/>
+                    </a:xfrm>
+                    <a:prstGeom prst="rect">
+                      <a:avLst/>
+                    </a:prstGeom>
+                  </pic:spPr>
+                </pic:pic>
+              </a:graphicData>
+            </a:graphic>
+          </wp:inline>
+        </w:drawing>
+      </w:r>
+    </w:p>
+    <w:p>
+      <w:pPr>
+        <w:rPr>
+          <w:sz w:val="26"/>
+          <w:szCs w:val="26"/>
+        </w:rPr>
+      </w:pPr>
+      <w:r>
+        <w:rPr>
+          <w:sz w:val="26"/>
+          <w:szCs w:val="26"/>
+        </w:rPr>
+        <w:lastRenderedPageBreak/>
+        <w:t>Thereupon</w:t>
+      </w:r>
+      <w:r>
+        <w:rPr>
+          <w:sz w:val="26"/>
+          <w:szCs w:val="26"/>
+        </w:rPr>
+        <w:t xml:space="preserve">, I </w:t>
+      </w:r>
+      <w:r>
+        <w:rPr>
+          <w:sz w:val="26"/>
+          <w:szCs w:val="26"/>
+        </w:rPr>
+        <w:t>have moved</w:t>
+      </w:r>
+      <w:r>
+        <w:rPr>
+          <w:sz w:val="26"/>
+          <w:szCs w:val="26"/>
+        </w:rPr>
+        <w:t xml:space="preserve"> to search for the next key.</w:t>
+      </w:r>
+      <w:r>
+        <w:rPr>
+          <w:sz w:val="26"/>
+          <w:szCs w:val="26"/>
+        </w:rPr>
+        <w:t xml:space="preserve"> I </w:t>
+      </w:r>
+      <w:r>
+        <w:rPr>
+          <w:sz w:val="26"/>
+          <w:szCs w:val="26"/>
+        </w:rPr>
+        <w:t xml:space="preserve">run Gobuster directories enumeration and found </w:t>
+      </w:r>
+      <w:r>
+        <w:rPr>
+          <w:sz w:val="26"/>
+          <w:szCs w:val="26"/>
+        </w:rPr>
+        <w:t>several pages:</w:t>
+      </w:r>
+    </w:p>
+    <w:p>
+      <w:pPr>
+        <w:rPr>
+          <w:sz w:val="26"/>
+          <w:szCs w:val="26"/>
+        </w:rPr>
+      </w:pPr>
+      <w:r>
+        <w:rPr>
+          <w:noProof/>
+        </w:rPr>
+        <w:drawing>
+          <wp:inline distT="0" distB="0" distL="0" distR="0" wp14:anchorId="476B75A5" wp14:editId="74F67522">
+            <wp:extent cx="4760941" cy="3881967"/>
+            <wp:effectExtent l="0" t="0" r="1905" b="4445"/>
+            <wp:docPr id="1939547817" name="תמונה 1"/>
+            <wp:cNvGraphicFramePr>
+              <a:graphicFrameLocks xmlns:a="http://schemas.openxmlformats.org/drawingml/2006/main" noChangeAspect="1"/>
+            </wp:cNvGraphicFramePr>
+            <a:graphic xmlns:a="http://schemas.openxmlformats.org/drawingml/2006/main">
+              <a:graphicData uri="http://schemas.openxmlformats.org/drawingml/2006/picture">
+                <pic:pic xmlns:pic="http://schemas.openxmlformats.org/drawingml/2006/picture">
+                  <pic:nvPicPr>
+                    <pic:cNvPr id="1939547817" name=""/>
+                    <pic:cNvPicPr/>
+                  </pic:nvPicPr>
+                  <pic:blipFill>
+                    <a:blip r:embed="rId9"/>
+                    <a:stretch>
+                      <a:fillRect/>
+                    </a:stretch>
+                  </pic:blipFill>
+                  <pic:spPr>
+                    <a:xfrm>
+                      <a:off x="0" y="0"/>
+                      <a:ext cx="4763292" cy="3883884"/>
+                    </a:xfrm>
+                    <a:prstGeom prst="rect">
+                      <a:avLst/>
+                    </a:prstGeom>
+                  </pic:spPr>
+                </pic:pic>
+              </a:graphicData>
+            </a:graphic>
+          </wp:inline>
+        </w:drawing>
+      </w:r>
+    </w:p>
+    <w:p>
+      <w:pPr>
+        <w:rPr>
+          <w:sz w:val="26"/>
+          <w:szCs w:val="26"/>
+        </w:rPr>
+      </w:pPr>
+      <w:r>
+        <w:rPr>
+          <w:color w:val="E97132" w:themeColor="accent2"/>
+          <w:sz w:val="26"/>
+          <w:szCs w:val="26"/>
+        </w:rPr>
+        <w:t xml:space="preserve">/sitemap </w:t>
+      </w:r>
+      <w:r>
+        <w:rPr>
+          <w:sz w:val="26"/>
+          <w:szCs w:val="26"/>
+        </w:rPr>
+        <w:t>moved me to an error message</w:t>
+      </w:r>
+      <w:r>
+        <w:rPr>
+          <w:sz w:val="26"/>
+          <w:szCs w:val="26"/>
+        </w:rPr>
+        <w:t>.</w:t>
+      </w:r>
+    </w:p>
+    <w:p>
+      <w:pPr>
+        <w:rPr>
+          <w:sz w:val="26"/>
+          <w:szCs w:val="26"/>
+        </w:rPr>
+      </w:pPr>
+      <w:r>
+        <w:rPr>
+          <w:color w:val="E97132" w:themeColor="accent2"/>
+          <w:sz w:val="26"/>
+          <w:szCs w:val="26"/>
+        </w:rPr>
+        <w:t>/</w:t>
+      </w:r>
+      <w:r>
+        <w:rPr>
+          <w:color w:val="E97132" w:themeColor="accent2"/>
+          <w:sz w:val="26"/>
+          <w:szCs w:val="26"/>
+        </w:rPr>
+        <w:t xml:space="preserve">readme </w:t>
+      </w:r>
+      <w:r>
+        <w:rPr>
+          <w:sz w:val="26"/>
+          <w:szCs w:val="26"/>
+        </w:rPr>
+        <w:t xml:space="preserve">loaded </w:t>
+      </w:r>
+      <w:r>
+        <w:rPr>
+          <w:sz w:val="26"/>
+          <w:szCs w:val="26"/>
+        </w:rPr>
+        <w:t>the following</w:t>
+      </w:r>
+      <w:r>
+        <w:rPr>
+          <w:sz w:val="26"/>
+          <w:szCs w:val="26"/>
+        </w:rPr>
+        <w:t xml:space="preserve"> text: “</w:t>
+      </w:r>
+      <w:r>
+        <w:rPr>
+          <w:sz w:val="26"/>
+          <w:szCs w:val="26"/>
+        </w:rPr>
+        <w:t xml:space="preserve">I like where you head is at. </w:t>
+      </w:r>
+      <w:r>
+        <w:rPr>
+          <w:sz w:val="26"/>
+          <w:szCs w:val="26"/>
+        </w:rPr>
+        <w:t>However</w:t>
+      </w:r>
+      <w:r>
+        <w:rPr>
+          <w:sz w:val="26"/>
+          <w:szCs w:val="26"/>
+        </w:rPr>
+        <w:t xml:space="preserve"> </w:t>
+      </w:r>
+      <w:r>
+        <w:rPr>
+          <w:sz w:val="26"/>
+          <w:szCs w:val="26"/>
+        </w:rPr>
+        <w:t>I'm not going to help you.</w:t>
+      </w:r>
+      <w:r>
+        <w:rPr>
+          <w:sz w:val="26"/>
+          <w:szCs w:val="26"/>
+        </w:rPr>
+        <w:t>”</w:t>
+      </w:r>
+      <w:r>
+        <w:rPr>
+          <w:sz w:val="26"/>
+          <w:szCs w:val="26"/>
+        </w:rPr>
+        <w:t>.</w:t>
+      </w:r>
+    </w:p>
+    <w:p>
+      <w:pPr>
+        <w:rPr>
+          <w:sz w:val="26"/>
+          <w:szCs w:val="26"/>
+        </w:rPr>
+      </w:pPr>
+      <w:r>
+        <w:rPr>
+          <w:color w:val="E97132" w:themeColor="accent2"/>
+          <w:sz w:val="26"/>
+          <w:szCs w:val="26"/>
+        </w:rPr>
+        <w:t xml:space="preserve">/wp-login </w:t>
+      </w:r>
+      <w:r>
+        <w:rPr>
+          <w:sz w:val="26"/>
+          <w:szCs w:val="26"/>
+        </w:rPr>
+        <w:t xml:space="preserve">made me understood that this is a </w:t>
+      </w:r>
+      <w:r>
+        <w:rPr>
+          <w:sz w:val="26"/>
+          <w:szCs w:val="26"/>
+        </w:rPr>
+        <w:t>WordPress</w:t>
+      </w:r>
+      <w:r>
+        <w:rPr>
+          <w:sz w:val="26"/>
+          <w:szCs w:val="26"/>
+        </w:rPr>
+        <w:t xml:space="preserve"> based website and it ha</w:t>
+      </w:r>
+      <w:r>
+        <w:rPr>
+          <w:sz w:val="26"/>
+          <w:szCs w:val="26"/>
+        </w:rPr>
+        <w:t>s</w:t>
+      </w:r>
+      <w:r>
+        <w:rPr>
+          <w:sz w:val="26"/>
+          <w:szCs w:val="26"/>
+        </w:rPr>
+        <w:t xml:space="preserve"> a login page.</w:t>
+      </w:r>
+    </w:p>
+    <w:p>
+      <w:pPr>
+        <w:rPr>
+          <w:sz w:val="26"/>
+          <w:szCs w:val="26"/>
+        </w:rPr>
+      </w:pPr>
+      <w:r>
+        <w:rPr>
+          <w:color w:val="E97132" w:themeColor="accent2"/>
+          <w:sz w:val="26"/>
+          <w:szCs w:val="26"/>
+        </w:rPr>
+        <w:t>/</w:t>
+      </w:r>
+      <w:r>
+        <w:rPr>
+          <w:color w:val="E97132" w:themeColor="accent2"/>
+          <w:sz w:val="26"/>
+          <w:szCs w:val="26"/>
+        </w:rPr>
+        <w:t xml:space="preserve">license </w:t>
+      </w:r>
+      <w:r>
+        <w:rPr>
+          <w:sz w:val="26"/>
+          <w:szCs w:val="26"/>
+        </w:rPr>
+        <w:t>loaded this text: “</w:t>
+      </w:r>
+      <w:r>
+        <w:rPr>
+          <w:sz w:val="26"/>
+          <w:szCs w:val="26"/>
+        </w:rPr>
+        <w:t>what you do just pull code from Rapid9 or some s@#% since when did you become a script kitty?</w:t>
+      </w:r>
+      <w:r>
+        <w:rPr>
+          <w:sz w:val="26"/>
+          <w:szCs w:val="26"/>
+        </w:rPr>
+        <w:t>”</w:t>
+      </w:r>
+    </w:p>
+    <w:p>
+      <w:pPr>
+        <w:rPr>
+          <w:sz w:val="26"/>
+          <w:szCs w:val="26"/>
+        </w:rPr>
+      </w:pPr>
+      <w:r>
+        <w:rPr>
+          <w:sz w:val="26"/>
+          <w:szCs w:val="26"/>
+        </w:rPr>
+        <w:t>So, at this point, I</w:t>
+      </w:r>
+      <w:r>
+        <w:rPr>
+          <w:sz w:val="26"/>
+          <w:szCs w:val="26"/>
+        </w:rPr>
+        <w:t xml:space="preserve"> returned to the login page and tried several common credentials</w:t>
+      </w:r>
+      <w:r>
+        <w:rPr>
+          <w:sz w:val="26"/>
+          <w:szCs w:val="26"/>
+        </w:rPr>
+        <w:t>. After that didn’t work, I moved to bruteforce credentials using hydra</w:t>
+      </w:r>
+      <w:r>
+        <w:rPr>
+          <w:sz w:val="26"/>
+          <w:szCs w:val="26"/>
+        </w:rPr>
+        <w:t>.</w:t>
+      </w:r>
+    </w:p>
+    <w:p>
+      <w:pPr>
+        <w:rPr>
+          <w:sz w:val="26"/>
+          <w:szCs w:val="26"/>
+        </w:rPr>
+      </w:pPr>
+      <w:r>
+        <w:rPr>
+          <w:sz w:val="26"/>
+          <w:szCs w:val="26"/>
+        </w:rPr>
+        <w:t>I began with usernames enumeration:</w:t>
+      </w:r>
+    </w:p>
+    <w:p>
+      <w:pPr>
+        <w:rPr>
+          <w:sz w:val="26"/>
+          <w:szCs w:val="26"/>
+        </w:rPr>
+      </w:pPr>
+      <w:r>
+        <w:rPr>
+          <w:b/>
+          <w:bCs/>
+          <w:sz w:val="26"/>
+          <w:szCs w:val="26"/>
+        </w:rPr>
+        <w:t>Notice</w:t>
+      </w:r>
+      <w:r>
+        <w:rPr>
+          <w:b/>
+          <w:bCs/>
+          <w:sz w:val="26"/>
+          <w:szCs w:val="26"/>
+        </w:rPr>
+        <w:t>:</w:t>
+      </w:r>
+      <w:r>
+        <w:rPr>
+          <w:sz w:val="26"/>
+          <w:szCs w:val="26"/>
+        </w:rPr>
+        <w:t xml:space="preserve"> I entered a random password because it doesn’t matter when enumerating usernames.</w:t>
+      </w:r>
+    </w:p>
+    <w:p>
+      <w:pPr>
+        <w:rPr>
+          <w:sz w:val="26"/>
+          <w:szCs w:val="26"/>
+        </w:rPr>
+      </w:pPr>
+      <w:r>
+        <w:rPr>
+          <w:noProof/>
+        </w:rPr>
+        <w:drawing>
+          <wp:inline distT="0" distB="0" distL="0" distR="0" wp14:anchorId="5266FACA" wp14:editId="67C017D4">
+            <wp:extent cx="7556500" cy="2086610"/>
+            <wp:effectExtent l="0" t="0" r="6350" b="8890"/>
+            <wp:docPr id="2068105607" name="תמונה 1"/>
+            <wp:cNvGraphicFramePr>
+              <a:graphicFrameLocks xmlns:a="http://schemas.openxmlformats.org/drawingml/2006/main" noChangeAspect="1"/>
+            </wp:cNvGraphicFramePr>
+            <a:graphic xmlns:a="http://schemas.openxmlformats.org/drawingml/2006/main">
+              <a:graphicData uri="http://schemas.openxmlformats.org/drawingml/2006/picture">
+                <pic:pic xmlns:pic="http://schemas.openxmlformats.org/drawingml/2006/picture">
+                  <pic:nvPicPr>
+                    <pic:cNvPr id="2068105607" name=""/>
+                    <pic:cNvPicPr/>
+                  </pic:nvPicPr>
+                  <pic:blipFill>
+                    <a:blip r:embed="rId10"/>
+                    <a:stretch>
+                      <a:fillRect/>
+                    </a:stretch>
+                  </pic:blipFill>
+                  <pic:spPr>
+                    <a:xfrm>
+                      <a:off x="0" y="0"/>
+                      <a:ext cx="7556500" cy="2086610"/>
+                    </a:xfrm>
+                    <a:prstGeom prst="rect">
+                      <a:avLst/>
+                    </a:prstGeom>
+                  </pic:spPr>
+                </pic:pic>
+              </a:graphicData>
+            </a:graphic>
+          </wp:inline>
+        </w:drawing>
+      </w:r>
+    </w:p>
+    <w:p>
+      <w:pPr>
+        <w:rPr>
+          <w:sz w:val="26"/>
+          <w:szCs w:val="26"/>
+        </w:rPr>
+      </w:pPr>
+    </w:p>
+    <w:p>
+      <w:pPr>
+        <w:rPr>
+          <w:sz w:val="26"/>
+          <w:szCs w:val="26"/>
+        </w:rPr>
+      </w:pPr>
+      <w:r>
+        <w:rPr>
+          <w:sz w:val="26"/>
+          <w:szCs w:val="26"/>
+        </w:rPr>
+        <w:lastRenderedPageBreak/>
+        <w:t xml:space="preserve">Now, I </w:t>
+      </w:r>
+      <w:r>
+        <w:rPr>
+          <w:sz w:val="26"/>
+          <w:szCs w:val="26"/>
+        </w:rPr>
+        <w:t>used the username “Elliot” to bruteforce his password</w:t>
+      </w:r>
+      <w:r>
+        <w:rPr>
+          <w:sz w:val="26"/>
+          <w:szCs w:val="26"/>
+        </w:rPr>
+        <w:t xml:space="preserve">, but before that, I realized that the “fsociety.dic” contains many similarities when the only differences in just capital letters (a thing that is ignored in WordPress login system) so I made the list shorted to get faster </w:t>
+      </w:r>
+      <w:r>
+        <w:rPr>
+          <w:sz w:val="26"/>
+          <w:szCs w:val="26"/>
+        </w:rPr>
+        <w:t xml:space="preserve">the </w:t>
+      </w:r>
+      <w:r>
+        <w:rPr>
+          <w:sz w:val="26"/>
+          <w:szCs w:val="26"/>
+        </w:rPr>
+        <w:t>bruteforce results</w:t>
+      </w:r>
+      <w:r>
+        <w:rPr>
+          <w:sz w:val="26"/>
+          <w:szCs w:val="26"/>
+        </w:rPr>
+        <w:t>:</w:t>
+      </w:r>
+    </w:p>
+    <w:p>
+      <w:pPr>
+        <w:rPr>
+          <w:sz w:val="26"/>
+          <w:szCs w:val="26"/>
+        </w:rPr>
+      </w:pPr>
+      <w:r>
+        <w:rPr>
+          <w:noProof/>
+        </w:rPr>
+        <w:drawing>
+          <wp:inline distT="0" distB="0" distL="0" distR="0" wp14:anchorId="2A777E2F" wp14:editId="62D3D57D">
+            <wp:extent cx="7556500" cy="1245235"/>
+            <wp:effectExtent l="0" t="0" r="6350" b="0"/>
+            <wp:docPr id="1666847086" name="תמונה 1" descr="תמונה שמכילה טקסט, צילום מסך, גופן, קו&#10;&#10;תוכן בינה מלאכותית גנרטיבית עשוי להיות שגוי."/>
+            <wp:cNvGraphicFramePr>
+              <a:graphicFrameLocks xmlns:a="http://schemas.openxmlformats.org/drawingml/2006/main" noChangeAspect="1"/>
+            </wp:cNvGraphicFramePr>
+            <a:graphic xmlns:a="http://schemas.openxmlformats.org/drawingml/2006/main">
+              <a:graphicData uri="http://schemas.openxmlformats.org/drawingml/2006/picture">
+                <pic:pic xmlns:pic="http://schemas.openxmlformats.org/drawingml/2006/picture">
+                  <pic:nvPicPr>
+                    <pic:cNvPr id="1666847086" name="תמונה 1" descr="תמונה שמכילה טקסט, צילום מסך, גופן, קו&#10;&#10;תוכן בינה מלאכותית גנרטיבית עשוי להיות שגוי."/>
+                    <pic:cNvPicPr/>
+                  </pic:nvPicPr>
+                  <pic:blipFill>
+                    <a:blip r:embed="rId11"/>
+                    <a:stretch>
+                      <a:fillRect/>
+                    </a:stretch>
+                  </pic:blipFill>
+                  <pic:spPr>
+                    <a:xfrm>
+                      <a:off x="0" y="0"/>
+                      <a:ext cx="7556500" cy="1245235"/>
+                    </a:xfrm>
+                    <a:prstGeom prst="rect">
+                      <a:avLst/>
+                    </a:prstGeom>
+                  </pic:spPr>
+                </pic:pic>
+              </a:graphicData>
+            </a:graphic>
+          </wp:inline>
+        </w:drawing>
+      </w:r>
+    </w:p>
+    <w:p>
+      <w:pPr>
+        <w:rPr>
+          <w:sz w:val="26"/>
+          <w:szCs w:val="26"/>
+          <w:rtl/>
+        </w:rPr>
+      </w:pPr>
+      <w:r>
+        <w:rPr>
+          <w:sz w:val="26"/>
+          <w:szCs w:val="26"/>
+        </w:rPr>
+        <w:t>Notice: I sorted the values with the similarities and removed them</w:t>
+      </w:r>
+      <w:r>
+        <w:rPr>
+          <w:sz w:val="26"/>
+          <w:szCs w:val="26"/>
+        </w:rPr>
+        <w:t xml:space="preserve"> while keeping only one instance</w:t>
+      </w:r>
+    </w:p>
+    <w:p>
+      <w:pPr>
+        <w:rPr>
+          <w:sz w:val="26"/>
+          <w:szCs w:val="26"/>
+        </w:rPr>
+      </w:pPr>
+      <w:r>
+        <w:rPr>
+          <w:sz w:val="26"/>
+          <w:szCs w:val="26"/>
+        </w:rPr>
+        <w:t>Now, I jus</w:t>
+      </w:r>
+      <w:r>
+        <w:rPr>
+          <w:sz w:val="26"/>
+          <w:szCs w:val="26"/>
+        </w:rPr>
+        <w:t>t bruteforce the new list using the “Elliot” username and found it’s password!</w:t>
+      </w:r>
+    </w:p>
+    <w:p>
+      <w:pPr>
+        <w:rPr>
+          <w:sz w:val="26"/>
+          <w:szCs w:val="26"/>
+        </w:rPr>
+      </w:pPr>
+      <w:r>
+        <w:rPr>
+          <w:sz w:val="26"/>
+          <w:szCs w:val="26"/>
+        </w:rPr>
+        <w:drawing>
+          <wp:inline distT="0" distB="0" distL="0" distR="0" wp14:anchorId="1278143E" wp14:editId="23AD47C5">
+            <wp:extent cx="7106266" cy="2667231"/>
+            <wp:effectExtent l="0" t="0" r="0" b="0"/>
+            <wp:docPr id="1553659344" name="תמונה 1"/>
+            <wp:cNvGraphicFramePr>
+              <a:graphicFrameLocks xmlns:a="http://schemas.openxmlformats.org/drawingml/2006/main" noChangeAspect="1"/>
+            </wp:cNvGraphicFramePr>
+            <a:graphic xmlns:a="http://schemas.openxmlformats.org/drawingml/2006/main">
+              <a:graphicData uri="http://schemas.openxmlformats.org/drawingml/2006/picture">
+                <pic:pic xmlns:pic="http://schemas.openxmlformats.org/drawingml/2006/picture">
+                  <pic:nvPicPr>
+                    <pic:cNvPr id="1553659344" name=""/>
+                    <pic:cNvPicPr/>
+                  </pic:nvPicPr>
+                  <pic:blipFill>
+                    <a:blip r:embed="rId12"/>
+                    <a:stretch>
+                      <a:fillRect/>
+                    </a:stretch>
+                  </pic:blipFill>
+                  <pic:spPr>
+                    <a:xfrm>
+                      <a:off x="0" y="0"/>
+                      <a:ext cx="7106266" cy="2667231"/>
+                    </a:xfrm>
+                    <a:prstGeom prst="rect">
+                      <a:avLst/>
+                    </a:prstGeom>
+                  </pic:spPr>
+                </pic:pic>
+              </a:graphicData>
+            </a:graphic>
+          </wp:inline>
+        </w:drawing>
+      </w:r>
+    </w:p>
+    <w:p>
+      <w:pPr>
+        <w:rPr>
+          <w:sz w:val="26"/>
+          <w:szCs w:val="26"/>
+        </w:rPr>
+      </w:pPr>
+      <w:r>
+        <w:rPr>
+          <w:sz w:val="26"/>
+          <w:szCs w:val="26"/>
+        </w:rPr>
+        <w:t>I entered the dashboard of his user:</w:t>
+      </w:r>
+    </w:p>
+    <w:p>
+      <w:pPr>
+        <w:rPr>
+          <w:sz w:val="26"/>
+          <w:szCs w:val="26"/>
+        </w:rPr>
+      </w:pPr>
+      <w:r>
+        <w:rPr>
+          <w:noProof/>
+        </w:rPr>
+        <w:drawing>
+          <wp:inline distT="0" distB="0" distL="0" distR="0" wp14:anchorId="3320A612" wp14:editId="3114440C">
+            <wp:extent cx="4220633" cy="3435738"/>
+            <wp:effectExtent l="0" t="0" r="8890" b="0"/>
+            <wp:docPr id="741918028" name="תמונה 1" descr="תמונה שמכילה טקסט, צילום מסך, תוכנה, סמל מחשב&#10;&#10;תוכן בינה מלאכותית גנרטיבית עשוי להיות שגוי."/>
+            <wp:cNvGraphicFramePr>
+              <a:graphicFrameLocks xmlns:a="http://schemas.openxmlformats.org/drawingml/2006/main" noChangeAspect="1"/>
+            </wp:cNvGraphicFramePr>
+            <a:graphic xmlns:a="http://schemas.openxmlformats.org/drawingml/2006/main">
+              <a:graphicData uri="http://schemas.openxmlformats.org/drawingml/2006/picture">
+                <pic:pic xmlns:pic="http://schemas.openxmlformats.org/drawingml/2006/picture">
+                  <pic:nvPicPr>
+                    <pic:cNvPr id="741918028" name="תמונה 1" descr="תמונה שמכילה טקסט, צילום מסך, תוכנה, סמל מחשב&#10;&#10;תוכן בינה מלאכותית גנרטיבית עשוי להיות שגוי."/>
+                    <pic:cNvPicPr/>
+                  </pic:nvPicPr>
+                  <pic:blipFill>
+                    <a:blip r:embed="rId13"/>
+                    <a:stretch>
+                      <a:fillRect/>
+                    </a:stretch>
+                  </pic:blipFill>
+                  <pic:spPr>
+                    <a:xfrm>
+                      <a:off x="0" y="0"/>
+                      <a:ext cx="4226652" cy="3440638"/>
+                    </a:xfrm>
+                    <a:prstGeom prst="rect">
+                      <a:avLst/>
+                    </a:prstGeom>
+                  </pic:spPr>
+                </pic:pic>
+              </a:graphicData>
+            </a:graphic>
+          </wp:inline>
+        </w:drawing>
+      </w:r>
+    </w:p>
+    <w:p>
+      <w:pPr>
+        <w:rPr>
+          <w:sz w:val="26"/>
+          <w:szCs w:val="26"/>
+        </w:rPr>
+      </w:pPr>
+      <w:r>
+        <w:rPr>
+          <w:sz w:val="26"/>
+          <w:szCs w:val="26"/>
+        </w:rPr>
+        <w:t>I navigated a bit to see some features that will help me find the second key.</w:t>
+      </w:r>
+    </w:p>
+    <w:p>
+      <w:pPr>
+        <w:rPr>
+          <w:sz w:val="26"/>
+          <w:szCs w:val="26"/>
+        </w:rPr>
+      </w:pPr>
+      <w:r>
+        <w:rPr>
+          <w:sz w:val="26"/>
+          <w:szCs w:val="26"/>
+        </w:rPr>
+        <w:lastRenderedPageBreak/>
+        <w:t xml:space="preserve">I found that on the media </w:t>
+      </w:r>
+      <w:r>
+        <w:rPr>
+          <w:sz w:val="26"/>
+          <w:szCs w:val="26"/>
+        </w:rPr>
+        <w:t>section, I can upload files:</w:t>
+      </w:r>
+    </w:p>
+    <w:p>
+      <w:pPr>
+        <w:rPr>
+          <w:sz w:val="26"/>
+          <w:szCs w:val="26"/>
+        </w:rPr>
+      </w:pPr>
+      <w:r>
+        <w:rPr>
+          <w:sz w:val="26"/>
+          <w:szCs w:val="26"/>
+        </w:rPr>
+        <w:drawing>
+          <wp:inline distT="0" distB="0" distL="0" distR="0" wp14:anchorId="4ACA161F" wp14:editId="08DB4D77">
+            <wp:extent cx="3810000" cy="3096749"/>
+            <wp:effectExtent l="0" t="0" r="0" b="8890"/>
+            <wp:docPr id="1832259118" name="תמונה 1"/>
+            <wp:cNvGraphicFramePr>
+              <a:graphicFrameLocks xmlns:a="http://schemas.openxmlformats.org/drawingml/2006/main" noChangeAspect="1"/>
+            </wp:cNvGraphicFramePr>
+            <a:graphic xmlns:a="http://schemas.openxmlformats.org/drawingml/2006/main">
+              <a:graphicData uri="http://schemas.openxmlformats.org/drawingml/2006/picture">
+                <pic:pic xmlns:pic="http://schemas.openxmlformats.org/drawingml/2006/picture">
+                  <pic:nvPicPr>
+                    <pic:cNvPr id="1832259118" name=""/>
+                    <pic:cNvPicPr/>
+                  </pic:nvPicPr>
+                  <pic:blipFill>
+                    <a:blip r:embed="rId14"/>
+                    <a:stretch>
+                      <a:fillRect/>
+                    </a:stretch>
+                  </pic:blipFill>
+                  <pic:spPr>
+                    <a:xfrm>
+                      <a:off x="0" y="0"/>
+                      <a:ext cx="3814717" cy="3100583"/>
+                    </a:xfrm>
+                    <a:prstGeom prst="rect">
+                      <a:avLst/>
+                    </a:prstGeom>
+                  </pic:spPr>
+                </pic:pic>
+              </a:graphicData>
+            </a:graphic>
+          </wp:inline>
+        </w:drawing>
+      </w:r>
+    </w:p>
+    <w:p>
+      <w:pPr>
+        <w:rPr>
+          <w:sz w:val="26"/>
+          <w:szCs w:val="26"/>
+        </w:rPr>
+      </w:pPr>
+      <w:r>
+        <w:rPr>
+          <w:sz w:val="26"/>
+          <w:szCs w:val="26"/>
+        </w:rPr>
+        <w:t>I used this php reverse shell script to get a shell over the target machine:</w:t>
+      </w:r>
+    </w:p>
+    <w:p>
+      <w:pPr>
+        <w:rPr>
+          <w:sz w:val="26"/>
+          <w:szCs w:val="26"/>
+        </w:rPr>
+      </w:pPr>
+      <w:r>
+        <w:rPr>
+          <w:noProof/>
+        </w:rPr>
+        <w:drawing>
+          <wp:inline distT="0" distB="0" distL="0" distR="0" wp14:anchorId="3ED7E0E2" wp14:editId="257CE5A4">
+            <wp:extent cx="4732866" cy="1678775"/>
+            <wp:effectExtent l="0" t="0" r="0" b="0"/>
+            <wp:docPr id="1342448804" name="תמונה 1" descr="תמונה שמכילה טקסט, צילום מסך, גופן, תוכנה&#10;&#10;תוכן בינה מלאכותית גנרטיבית עשוי להיות שגוי."/>
+            <wp:cNvGraphicFramePr>
+              <a:graphicFrameLocks xmlns:a="http://schemas.openxmlformats.org/drawingml/2006/main" noChangeAspect="1"/>
+            </wp:cNvGraphicFramePr>
+            <a:graphic xmlns:a="http://schemas.openxmlformats.org/drawingml/2006/main">
+              <a:graphicData uri="http://schemas.openxmlformats.org/drawingml/2006/picture">
+                <pic:pic xmlns:pic="http://schemas.openxmlformats.org/drawingml/2006/picture">
+                  <pic:nvPicPr>
+                    <pic:cNvPr id="1342448804" name="תמונה 1" descr="תמונה שמכילה טקסט, צילום מסך, גופן, תוכנה&#10;&#10;תוכן בינה מלאכותית גנרטיבית עשוי להיות שגוי."/>
+                    <pic:cNvPicPr/>
+                  </pic:nvPicPr>
+                  <pic:blipFill>
+                    <a:blip r:embed="rId15"/>
+                    <a:stretch>
+                      <a:fillRect/>
+                    </a:stretch>
+                  </pic:blipFill>
+                  <pic:spPr>
+                    <a:xfrm>
+                      <a:off x="0" y="0"/>
+                      <a:ext cx="4747446" cy="1683946"/>
+                    </a:xfrm>
+                    <a:prstGeom prst="rect">
+                      <a:avLst/>
+                    </a:prstGeom>
+                  </pic:spPr>
+                </pic:pic>
+              </a:graphicData>
+            </a:graphic>
+          </wp:inline>
+        </w:drawing>
+      </w:r>
+    </w:p>
+    <w:p>
+      <w:pPr>
+        <w:rPr>
+          <w:sz w:val="26"/>
+          <w:szCs w:val="26"/>
+        </w:rPr>
+      </w:pPr>
+      <w:r>
+        <w:rPr>
+          <w:sz w:val="26"/>
+          <w:szCs w:val="26"/>
+        </w:rPr>
+        <w:t xml:space="preserve">I </w:t>
+      </w:r>
+      <w:r>
+        <w:rPr>
+          <w:sz w:val="26"/>
+          <w:szCs w:val="26"/>
+        </w:rPr>
+        <w:t>tried to upload it but I faced with an error message:</w:t>
+      </w:r>
+    </w:p>
+    <w:p>
+      <w:pPr>
+        <w:rPr>
+          <w:sz w:val="26"/>
+          <w:szCs w:val="26"/>
+        </w:rPr>
+      </w:pPr>
+      <w:r>
+        <w:rPr>
+          <w:noProof/>
+        </w:rPr>
+        <w:drawing>
+          <wp:inline distT="0" distB="0" distL="0" distR="0" wp14:anchorId="5E05CD75" wp14:editId="3425632C">
+            <wp:extent cx="4969933" cy="883373"/>
+            <wp:effectExtent l="0" t="0" r="2540" b="0"/>
+            <wp:docPr id="2046321823" name="תמונה 1" descr="תמונה שמכילה טקסט, גופן, לבן, צילום מסך&#10;&#10;תוכן בינה מלאכותית גנרטיבית עשוי להיות שגוי."/>
+            <wp:cNvGraphicFramePr>
+              <a:graphicFrameLocks xmlns:a="http://schemas.openxmlformats.org/drawingml/2006/main" noChangeAspect="1"/>
+            </wp:cNvGraphicFramePr>
+            <a:graphic xmlns:a="http://schemas.openxmlformats.org/drawingml/2006/main">
+              <a:graphicData uri="http://schemas.openxmlformats.org/drawingml/2006/picture">
+                <pic:pic xmlns:pic="http://schemas.openxmlformats.org/drawingml/2006/picture">
+                  <pic:nvPicPr>
+                    <pic:cNvPr id="2046321823" name="תמונה 1" descr="תמונה שמכילה טקסט, גופן, לבן, צילום מסך&#10;&#10;תוכן בינה מלאכותית גנרטיבית עשוי להיות שגוי."/>
+                    <pic:cNvPicPr/>
+                  </pic:nvPicPr>
+                  <pic:blipFill>
+                    <a:blip r:embed="rId16"/>
+                    <a:stretch>
+                      <a:fillRect/>
+                    </a:stretch>
+                  </pic:blipFill>
+                  <pic:spPr>
+                    <a:xfrm>
+                      <a:off x="0" y="0"/>
+                      <a:ext cx="4980792" cy="885303"/>
+                    </a:xfrm>
+                    <a:prstGeom prst="rect">
+                      <a:avLst/>
+                    </a:prstGeom>
+                  </pic:spPr>
+                </pic:pic>
+              </a:graphicData>
+            </a:graphic>
+          </wp:inline>
+        </w:drawing>
+      </w:r>
+    </w:p>
+    <w:p>
+      <w:pPr>
+        <w:rPr>
+          <w:rtl/>
+        </w:rPr>
+      </w:pPr>
+      <w:r>
+        <w:rPr>
+          <w:sz w:val="26"/>
+          <w:szCs w:val="26"/>
+        </w:rPr>
+        <w:t xml:space="preserve">Now, I </w:t>
+      </w:r>
+      <w:r>
+        <w:rPr>
+          <w:sz w:val="26"/>
+          <w:szCs w:val="26"/>
+        </w:rPr>
+        <w:t xml:space="preserve">searched for </w:t>
+      </w:r>
+      <w:r>
+        <w:rPr>
+          <w:sz w:val="26"/>
+          <w:szCs w:val="26"/>
+        </w:rPr>
+        <w:t>another way to upload it.</w:t>
+      </w:r>
+      <w:r>
+        <w:t xml:space="preserve"> After couple of minutes, I found that </w:t>
       </w:r>
     </w:p>
     <w:sectPr>
@@ -919,7 +2514,6 @@
   <w:style w:type="character" w:default="1" w:styleId="a0">
     <w:name w:val="Default Paragraph Font"/>
     <w:uiPriority w:val="1"/>
-    <w:semiHidden/>
     <w:unhideWhenUsed/>
   </w:style>
   <w:style w:type="table" w:default="1" w:styleId="a1">

</xml_diff>

<commit_message>
I finished the Mr. Robot thm ctf
</commit_message>
<xml_diff>
--- a/THM_challenges/Medium/Mr Robot CTF/Mr Robot CTF_Solution_Documentation.docx
+++ b/THM_challenges/Medium/Mr Robot CTF/Mr Robot CTF_Solution_Documentation.docx
@@ -1546,6 +1546,7 @@
       </w:pPr>
       <w:r>
         <w:rPr>
+          <w:noProof/>
           <w:sz w:val="26"/>
           <w:szCs w:val="26"/>
         </w:rPr>
@@ -1696,6 +1697,7 @@
       </w:pPr>
       <w:r>
         <w:rPr>
+          <w:noProof/>
           <w:sz w:val="26"/>
           <w:szCs w:val="26"/>
         </w:rPr>
@@ -1872,7 +1874,8 @@
     <w:p>
       <w:pPr>
         <w:rPr>
-          <w:rtl/>
+          <w:sz w:val="26"/>
+          <w:szCs w:val="26"/>
         </w:rPr>
       </w:pPr>
       <w:r>
@@ -1897,7 +1900,759 @@
         <w:t>another way to upload it.</w:t>
       </w:r>
       <w:r>
-        <w:t xml:space="preserve"> After couple of minutes, I found that </w:t>
+        <w:rPr>
+          <w:sz w:val="26"/>
+          <w:szCs w:val="26"/>
+        </w:rPr>
+        <w:t xml:space="preserve"> After couple of </w:t>
+      </w:r>
+      <w:r>
+        <w:rPr>
+          <w:sz w:val="26"/>
+          <w:szCs w:val="26"/>
+        </w:rPr>
+        <w:t>seconds,</w:t>
+      </w:r>
+      <w:r>
+        <w:rPr>
+          <w:sz w:val="26"/>
+          <w:szCs w:val="26"/>
+        </w:rPr>
+        <w:t xml:space="preserve"> I found that I have access to the editor in the “appearance” tab so I can change several files</w:t>
+      </w:r>
+      <w:r>
+        <w:rPr>
+          <w:sz w:val="26"/>
+          <w:szCs w:val="26"/>
+        </w:rPr>
+        <w:t xml:space="preserve"> (including .php files)</w:t>
+      </w:r>
+      <w:r>
+        <w:rPr>
+          <w:sz w:val="26"/>
+          <w:szCs w:val="26"/>
+        </w:rPr>
+        <w:t xml:space="preserve">. So, I changed the </w:t>
+      </w:r>
+      <w:r>
+        <w:rPr>
+          <w:sz w:val="26"/>
+          <w:szCs w:val="26"/>
+        </w:rPr>
+        <w:t>404-custom</w:t>
+      </w:r>
+      <w:r>
+        <w:rPr>
+          <w:sz w:val="26"/>
+          <w:szCs w:val="26"/>
+        </w:rPr>
+        <w:t xml:space="preserve"> page to this php code so it will behave like the rev shell</w:t>
+      </w:r>
+      <w:r>
+        <w:rPr>
+          <w:sz w:val="26"/>
+          <w:szCs w:val="26"/>
+        </w:rPr>
+        <w:t xml:space="preserve"> file</w:t>
+      </w:r>
+      <w:r>
+        <w:rPr>
+          <w:sz w:val="26"/>
+          <w:szCs w:val="26"/>
+        </w:rPr>
+        <w:t>.</w:t>
+      </w:r>
+    </w:p>
+    <w:p>
+      <w:r>
+        <w:drawing>
+          <wp:inline distT="0" distB="0" distL="0" distR="0" wp14:anchorId="61810E62" wp14:editId="247137B3">
+            <wp:extent cx="7480300" cy="1573724"/>
+            <wp:effectExtent l="0" t="0" r="6350" b="7620"/>
+            <wp:docPr id="140950176" name="תמונה 1" descr="תמונה שמכילה טקסט, גופן, צילום מסך&#10;&#10;תוכן בינה מלאכותית גנרטיבית עשוי להיות שגוי."/>
+            <wp:cNvGraphicFramePr>
+              <a:graphicFrameLocks xmlns:a="http://schemas.openxmlformats.org/drawingml/2006/main" noChangeAspect="1"/>
+            </wp:cNvGraphicFramePr>
+            <a:graphic xmlns:a="http://schemas.openxmlformats.org/drawingml/2006/main">
+              <a:graphicData uri="http://schemas.openxmlformats.org/drawingml/2006/picture">
+                <pic:pic xmlns:pic="http://schemas.openxmlformats.org/drawingml/2006/picture">
+                  <pic:nvPicPr>
+                    <pic:cNvPr id="140950176" name="תמונה 1" descr="תמונה שמכילה טקסט, גופן, צילום מסך&#10;&#10;תוכן בינה מלאכותית גנרטיבית עשוי להיות שגוי."/>
+                    <pic:cNvPicPr/>
+                  </pic:nvPicPr>
+                  <pic:blipFill>
+                    <a:blip r:embed="rId17"/>
+                    <a:stretch>
+                      <a:fillRect/>
+                    </a:stretch>
+                  </pic:blipFill>
+                  <pic:spPr>
+                    <a:xfrm>
+                      <a:off x="0" y="0"/>
+                      <a:ext cx="7500252" cy="1577922"/>
+                    </a:xfrm>
+                    <a:prstGeom prst="rect">
+                      <a:avLst/>
+                    </a:prstGeom>
+                  </pic:spPr>
+                </pic:pic>
+              </a:graphicData>
+            </a:graphic>
+          </wp:inline>
+        </w:drawing>
+      </w:r>
+    </w:p>
+    <w:p>
+      <w:r>
+        <w:t xml:space="preserve">Now, I created a netcat listener on port 4444 on my machine </w:t>
+      </w:r>
+      <w:r>
+        <w:t xml:space="preserve">so I can </w:t>
+      </w:r>
+      <w:r>
+        <w:t>listen to the rev shell request from the target.</w:t>
+      </w:r>
+    </w:p>
+    <w:p>
+      <w:r>
+        <w:lastRenderedPageBreak/>
+        <w:t xml:space="preserve">And in the end, </w:t>
+      </w:r>
+      <w:r>
+        <w:t xml:space="preserve">when I entered the 404.php file using this url “target-ip/404.php” I got </w:t>
+      </w:r>
+      <w:r>
+        <w:t>the targets shell:</w:t>
+      </w:r>
+    </w:p>
+    <w:p>
+      <w:r>
+        <w:rPr>
+          <w:noProof/>
+        </w:rPr>
+        <w:drawing>
+          <wp:inline distT="0" distB="0" distL="0" distR="0" wp14:anchorId="42B7C8A3" wp14:editId="761B63BA">
+            <wp:extent cx="7556500" cy="1087755"/>
+            <wp:effectExtent l="0" t="0" r="6350" b="0"/>
+            <wp:docPr id="1876867865" name="תמונה 1"/>
+            <wp:cNvGraphicFramePr>
+              <a:graphicFrameLocks xmlns:a="http://schemas.openxmlformats.org/drawingml/2006/main" noChangeAspect="1"/>
+            </wp:cNvGraphicFramePr>
+            <a:graphic xmlns:a="http://schemas.openxmlformats.org/drawingml/2006/main">
+              <a:graphicData uri="http://schemas.openxmlformats.org/drawingml/2006/picture">
+                <pic:pic xmlns:pic="http://schemas.openxmlformats.org/drawingml/2006/picture">
+                  <pic:nvPicPr>
+                    <pic:cNvPr id="1876867865" name=""/>
+                    <pic:cNvPicPr/>
+                  </pic:nvPicPr>
+                  <pic:blipFill>
+                    <a:blip r:embed="rId18"/>
+                    <a:stretch>
+                      <a:fillRect/>
+                    </a:stretch>
+                  </pic:blipFill>
+                  <pic:spPr>
+                    <a:xfrm>
+                      <a:off x="0" y="0"/>
+                      <a:ext cx="7556500" cy="1087755"/>
+                    </a:xfrm>
+                    <a:prstGeom prst="rect">
+                      <a:avLst/>
+                    </a:prstGeom>
+                  </pic:spPr>
+                </pic:pic>
+              </a:graphicData>
+            </a:graphic>
+          </wp:inline>
+        </w:drawing>
+      </w:r>
+    </w:p>
+    <w:p>
+      <w:r>
+        <w:t xml:space="preserve">At this point, I entered the /home directory and found the robot’s user directory which contained the second key(which was </w:t>
+      </w:r>
+      <w:r>
+        <w:t>stored</w:t>
+      </w:r>
+      <w:r>
+        <w:t xml:space="preserve"> in a txt file which a reading permission only to robot) and his password in md5(which was stored in a .raw-md5 file)</w:t>
+      </w:r>
+      <w:r>
+        <w:t>.</w:t>
+      </w:r>
+    </w:p>
+    <w:p>
+      <w:r>
+        <w:t xml:space="preserve">I had couple of tools for decrypting md5 hash (which is of course </w:t>
+      </w:r>
+      <w:r>
+        <w:t xml:space="preserve">not </w:t>
+      </w:r>
+      <w:r>
+        <w:t xml:space="preserve">a </w:t>
+      </w:r>
+      <w:r>
+        <w:t>direct decryption because it’s an hash</w:t>
+      </w:r>
+      <w:r>
+        <w:t>)</w:t>
+      </w:r>
+      <w:r>
+        <w:t xml:space="preserve"> but I tried to use “John The R</w:t>
+      </w:r>
+      <w:r>
+        <w:t>ipper</w:t>
+      </w:r>
+      <w:r>
+        <w:t>”. This is the hash of the password:</w:t>
+      </w:r>
+    </w:p>
+    <w:p>
+      <w:r>
+        <w:rPr>
+          <w:noProof/>
+        </w:rPr>
+        <w:drawing>
+          <wp:inline distT="0" distB="0" distL="0" distR="0" wp14:anchorId="3FD4DAF5" wp14:editId="63E0C05F">
+            <wp:extent cx="6096000" cy="590550"/>
+            <wp:effectExtent l="0" t="0" r="0" b="0"/>
+            <wp:docPr id="727457517" name="תמונה 1"/>
+            <wp:cNvGraphicFramePr>
+              <a:graphicFrameLocks xmlns:a="http://schemas.openxmlformats.org/drawingml/2006/main" noChangeAspect="1"/>
+            </wp:cNvGraphicFramePr>
+            <a:graphic xmlns:a="http://schemas.openxmlformats.org/drawingml/2006/main">
+              <a:graphicData uri="http://schemas.openxmlformats.org/drawingml/2006/picture">
+                <pic:pic xmlns:pic="http://schemas.openxmlformats.org/drawingml/2006/picture">
+                  <pic:nvPicPr>
+                    <pic:cNvPr id="727457517" name=""/>
+                    <pic:cNvPicPr/>
+                  </pic:nvPicPr>
+                  <pic:blipFill>
+                    <a:blip r:embed="rId19"/>
+                    <a:stretch>
+                      <a:fillRect/>
+                    </a:stretch>
+                  </pic:blipFill>
+                  <pic:spPr>
+                    <a:xfrm>
+                      <a:off x="0" y="0"/>
+                      <a:ext cx="6096000" cy="590550"/>
+                    </a:xfrm>
+                    <a:prstGeom prst="rect">
+                      <a:avLst/>
+                    </a:prstGeom>
+                  </pic:spPr>
+                </pic:pic>
+              </a:graphicData>
+            </a:graphic>
+          </wp:inline>
+        </w:drawing>
+      </w:r>
+    </w:p>
+    <w:p>
+      <w:r>
+        <w:t xml:space="preserve">Now, I </w:t>
+      </w:r>
+      <w:r>
+        <w:t xml:space="preserve">used the rockyou.txt file as a </w:t>
+      </w:r>
+      <w:r>
+        <w:t>wordlist</w:t>
+      </w:r>
+      <w:r>
+        <w:t xml:space="preserve"> in the tool and I found the password:</w:t>
+      </w:r>
+    </w:p>
+    <w:p>
+      <w:r>
+        <w:drawing>
+          <wp:inline distT="0" distB="0" distL="0" distR="0" wp14:anchorId="23F61964" wp14:editId="3338E3E6">
+            <wp:extent cx="5867908" cy="1276461"/>
+            <wp:effectExtent l="0" t="0" r="0" b="0"/>
+            <wp:docPr id="1146055159" name="תמונה 1"/>
+            <wp:cNvGraphicFramePr>
+              <a:graphicFrameLocks xmlns:a="http://schemas.openxmlformats.org/drawingml/2006/main" noChangeAspect="1"/>
+            </wp:cNvGraphicFramePr>
+            <a:graphic xmlns:a="http://schemas.openxmlformats.org/drawingml/2006/main">
+              <a:graphicData uri="http://schemas.openxmlformats.org/drawingml/2006/picture">
+                <pic:pic xmlns:pic="http://schemas.openxmlformats.org/drawingml/2006/picture">
+                  <pic:nvPicPr>
+                    <pic:cNvPr id="1146055159" name=""/>
+                    <pic:cNvPicPr/>
+                  </pic:nvPicPr>
+                  <pic:blipFill>
+                    <a:blip r:embed="rId20"/>
+                    <a:stretch>
+                      <a:fillRect/>
+                    </a:stretch>
+                  </pic:blipFill>
+                  <pic:spPr>
+                    <a:xfrm>
+                      <a:off x="0" y="0"/>
+                      <a:ext cx="5867908" cy="1276461"/>
+                    </a:xfrm>
+                    <a:prstGeom prst="rect">
+                      <a:avLst/>
+                    </a:prstGeom>
+                  </pic:spPr>
+                </pic:pic>
+              </a:graphicData>
+            </a:graphic>
+          </wp:inline>
+        </w:drawing>
+      </w:r>
+    </w:p>
+    <w:p>
+      <w:r>
+        <w:t>Then, I tried to login as robot using this password and it worked!!!</w:t>
+      </w:r>
+    </w:p>
+    <w:p>
+      <w:r>
+        <w:rPr>
+          <w:noProof/>
+        </w:rPr>
+        <w:drawing>
+          <wp:inline distT="0" distB="0" distL="0" distR="0" wp14:anchorId="54667A3F" wp14:editId="23D95F4A">
+            <wp:extent cx="6079066" cy="1261789"/>
+            <wp:effectExtent l="0" t="0" r="0" b="0"/>
+            <wp:docPr id="1064422725" name="תמונה 1"/>
+            <wp:cNvGraphicFramePr>
+              <a:graphicFrameLocks xmlns:a="http://schemas.openxmlformats.org/drawingml/2006/main" noChangeAspect="1"/>
+            </wp:cNvGraphicFramePr>
+            <a:graphic xmlns:a="http://schemas.openxmlformats.org/drawingml/2006/main">
+              <a:graphicData uri="http://schemas.openxmlformats.org/drawingml/2006/picture">
+                <pic:pic xmlns:pic="http://schemas.openxmlformats.org/drawingml/2006/picture">
+                  <pic:nvPicPr>
+                    <pic:cNvPr id="1064422725" name=""/>
+                    <pic:cNvPicPr/>
+                  </pic:nvPicPr>
+                  <pic:blipFill>
+                    <a:blip r:embed="rId21"/>
+                    <a:stretch>
+                      <a:fillRect/>
+                    </a:stretch>
+                  </pic:blipFill>
+                  <pic:spPr>
+                    <a:xfrm>
+                      <a:off x="0" y="0"/>
+                      <a:ext cx="6085840" cy="1263195"/>
+                    </a:xfrm>
+                    <a:prstGeom prst="rect">
+                      <a:avLst/>
+                    </a:prstGeom>
+                  </pic:spPr>
+                </pic:pic>
+              </a:graphicData>
+            </a:graphic>
+          </wp:inline>
+        </w:drawing>
+      </w:r>
+    </w:p>
+    <w:p>
+      <w:r>
+        <w:t>And this is the second key:</w:t>
+      </w:r>
+    </w:p>
+    <w:p>
+      <w:r>
+        <w:rPr>
+          <w:noProof/>
+        </w:rPr>
+        <w:drawing>
+          <wp:inline distT="0" distB="0" distL="0" distR="0" wp14:anchorId="6B5C0E82" wp14:editId="6DC46CB6">
+            <wp:extent cx="5257800" cy="666750"/>
+            <wp:effectExtent l="0" t="0" r="0" b="0"/>
+            <wp:docPr id="192013430" name="תמונה 1" descr="תמונה שמכילה טקסט, גופן, צילום מסך, גרפיקה&#10;&#10;תוכן בינה מלאכותית גנרטיבית עשוי להיות שגוי."/>
+            <wp:cNvGraphicFramePr>
+              <a:graphicFrameLocks xmlns:a="http://schemas.openxmlformats.org/drawingml/2006/main" noChangeAspect="1"/>
+            </wp:cNvGraphicFramePr>
+            <a:graphic xmlns:a="http://schemas.openxmlformats.org/drawingml/2006/main">
+              <a:graphicData uri="http://schemas.openxmlformats.org/drawingml/2006/picture">
+                <pic:pic xmlns:pic="http://schemas.openxmlformats.org/drawingml/2006/picture">
+                  <pic:nvPicPr>
+                    <pic:cNvPr id="192013430" name="תמונה 1" descr="תמונה שמכילה טקסט, גופן, צילום מסך, גרפיקה&#10;&#10;תוכן בינה מלאכותית גנרטיבית עשוי להיות שגוי."/>
+                    <pic:cNvPicPr/>
+                  </pic:nvPicPr>
+                  <pic:blipFill>
+                    <a:blip r:embed="rId22"/>
+                    <a:stretch>
+                      <a:fillRect/>
+                    </a:stretch>
+                  </pic:blipFill>
+                  <pic:spPr>
+                    <a:xfrm>
+                      <a:off x="0" y="0"/>
+                      <a:ext cx="5257800" cy="666750"/>
+                    </a:xfrm>
+                    <a:prstGeom prst="rect">
+                      <a:avLst/>
+                    </a:prstGeom>
+                  </pic:spPr>
+                </pic:pic>
+              </a:graphicData>
+            </a:graphic>
+          </wp:inline>
+        </w:drawing>
+      </w:r>
+    </w:p>
+    <w:p>
+      <w:r>
+        <w:t>Before I continued to the last key</w:t>
+      </w:r>
+      <w:r>
+        <w:t>,</w:t>
+      </w:r>
+      <w:r>
+        <w:t xml:space="preserve"> </w:t>
+      </w:r>
+      <w:r>
+        <w:t>I</w:t>
+      </w:r>
+      <w:r>
+        <w:t xml:space="preserve"> upgraded my shell to a</w:t>
+      </w:r>
+      <w:r>
+        <w:t xml:space="preserve"> more</w:t>
+      </w:r>
+      <w:r>
+        <w:t xml:space="preserve"> interactive one by using the command “/bin/bash -i”</w:t>
+      </w:r>
+      <w:r>
+        <w:t>:</w:t>
+      </w:r>
+    </w:p>
+    <w:p>
+      <w:r>
+        <w:drawing>
+          <wp:inline distT="0" distB="0" distL="0" distR="0" wp14:anchorId="258F5CE7" wp14:editId="07EBDCB8">
+            <wp:extent cx="4999153" cy="533446"/>
+            <wp:effectExtent l="0" t="0" r="0" b="0"/>
+            <wp:docPr id="1072964028" name="תמונה 1"/>
+            <wp:cNvGraphicFramePr>
+              <a:graphicFrameLocks xmlns:a="http://schemas.openxmlformats.org/drawingml/2006/main" noChangeAspect="1"/>
+            </wp:cNvGraphicFramePr>
+            <a:graphic xmlns:a="http://schemas.openxmlformats.org/drawingml/2006/main">
+              <a:graphicData uri="http://schemas.openxmlformats.org/drawingml/2006/picture">
+                <pic:pic xmlns:pic="http://schemas.openxmlformats.org/drawingml/2006/picture">
+                  <pic:nvPicPr>
+                    <pic:cNvPr id="1072964028" name=""/>
+                    <pic:cNvPicPr/>
+                  </pic:nvPicPr>
+                  <pic:blipFill>
+                    <a:blip r:embed="rId23"/>
+                    <a:stretch>
+                      <a:fillRect/>
+                    </a:stretch>
+                  </pic:blipFill>
+                  <pic:spPr>
+                    <a:xfrm>
+                      <a:off x="0" y="0"/>
+                      <a:ext cx="4999153" cy="533446"/>
+                    </a:xfrm>
+                    <a:prstGeom prst="rect">
+                      <a:avLst/>
+                    </a:prstGeom>
+                  </pic:spPr>
+                </pic:pic>
+              </a:graphicData>
+            </a:graphic>
+          </wp:inline>
+        </w:drawing>
+      </w:r>
+    </w:p>
+    <w:p>
+      <w:r>
+        <w:t xml:space="preserve">And all that </w:t>
+      </w:r>
+      <w:r>
+        <w:t>is left</w:t>
+      </w:r>
+      <w:r>
+        <w:t xml:space="preserve"> is to find the last key which is probably in the root’s user folder.</w:t>
+      </w:r>
+    </w:p>
+    <w:p>
+      <w:r>
+        <w:t>I checked my current root privileges using this command:</w:t>
+      </w:r>
+    </w:p>
+    <w:p>
+      <w:r>
+        <w:rPr>
+          <w:noProof/>
+        </w:rPr>
+        <w:lastRenderedPageBreak/>
+        <w:drawing>
+          <wp:inline distT="0" distB="0" distL="0" distR="0" wp14:anchorId="37FFAAF7" wp14:editId="5663715C">
+            <wp:extent cx="7556500" cy="1096010"/>
+            <wp:effectExtent l="0" t="0" r="6350" b="8890"/>
+            <wp:docPr id="779187213" name="תמונה 1"/>
+            <wp:cNvGraphicFramePr>
+              <a:graphicFrameLocks xmlns:a="http://schemas.openxmlformats.org/drawingml/2006/main" noChangeAspect="1"/>
+            </wp:cNvGraphicFramePr>
+            <a:graphic xmlns:a="http://schemas.openxmlformats.org/drawingml/2006/main">
+              <a:graphicData uri="http://schemas.openxmlformats.org/drawingml/2006/picture">
+                <pic:pic xmlns:pic="http://schemas.openxmlformats.org/drawingml/2006/picture">
+                  <pic:nvPicPr>
+                    <pic:cNvPr id="779187213" name=""/>
+                    <pic:cNvPicPr/>
+                  </pic:nvPicPr>
+                  <pic:blipFill>
+                    <a:blip r:embed="rId24"/>
+                    <a:stretch>
+                      <a:fillRect/>
+                    </a:stretch>
+                  </pic:blipFill>
+                  <pic:spPr>
+                    <a:xfrm>
+                      <a:off x="0" y="0"/>
+                      <a:ext cx="7556500" cy="1096010"/>
+                    </a:xfrm>
+                    <a:prstGeom prst="rect">
+                      <a:avLst/>
+                    </a:prstGeom>
+                  </pic:spPr>
+                </pic:pic>
+              </a:graphicData>
+            </a:graphic>
+          </wp:inline>
+        </w:drawing>
+      </w:r>
+    </w:p>
+    <w:p>
+      <w:r>
+        <w:t>Notice: I used the ‘-S’ because I don’t have a full TTY shell.</w:t>
+      </w:r>
+    </w:p>
+    <w:p>
+      <w:r>
+        <w:t>I</w:t>
+      </w:r>
+      <w:r>
+        <w:t xml:space="preserve"> saw that I have </w:t>
+      </w:r>
+      <w:r>
+        <w:t>n</w:t>
+      </w:r>
+      <w:r>
+        <w:t xml:space="preserve">o root </w:t>
+      </w:r>
+      <w:r>
+        <w:t xml:space="preserve">privileges </w:t>
+      </w:r>
+      <w:r>
+        <w:t xml:space="preserve">so I moved to check </w:t>
+      </w:r>
+      <w:r>
+        <w:t>any suid binary that I can escalate my privileges by.</w:t>
+      </w:r>
+    </w:p>
+    <w:p>
+      <w:r>
+        <w:t>I used this command:</w:t>
+      </w:r>
+    </w:p>
+    <w:p>
+      <w:r>
+        <w:drawing>
+          <wp:inline distT="0" distB="0" distL="0" distR="0" wp14:anchorId="7024066D" wp14:editId="3117793C">
+            <wp:extent cx="4439035" cy="2343353"/>
+            <wp:effectExtent l="0" t="0" r="0" b="0"/>
+            <wp:docPr id="2047425262" name="תמונה 1"/>
+            <wp:cNvGraphicFramePr>
+              <a:graphicFrameLocks xmlns:a="http://schemas.openxmlformats.org/drawingml/2006/main" noChangeAspect="1"/>
+            </wp:cNvGraphicFramePr>
+            <a:graphic xmlns:a="http://schemas.openxmlformats.org/drawingml/2006/main">
+              <a:graphicData uri="http://schemas.openxmlformats.org/drawingml/2006/picture">
+                <pic:pic xmlns:pic="http://schemas.openxmlformats.org/drawingml/2006/picture">
+                  <pic:nvPicPr>
+                    <pic:cNvPr id="2047425262" name=""/>
+                    <pic:cNvPicPr/>
+                  </pic:nvPicPr>
+                  <pic:blipFill>
+                    <a:blip r:embed="rId25"/>
+                    <a:stretch>
+                      <a:fillRect/>
+                    </a:stretch>
+                  </pic:blipFill>
+                  <pic:spPr>
+                    <a:xfrm>
+                      <a:off x="0" y="0"/>
+                      <a:ext cx="4439035" cy="2343353"/>
+                    </a:xfrm>
+                    <a:prstGeom prst="rect">
+                      <a:avLst/>
+                    </a:prstGeom>
+                  </pic:spPr>
+                </pic:pic>
+              </a:graphicData>
+            </a:graphic>
+          </wp:inline>
+        </w:drawing>
+      </w:r>
+    </w:p>
+    <w:p>
+      <w:r>
+        <w:t xml:space="preserve">I noticed that there is a nmap </w:t>
+      </w:r>
+      <w:r>
+        <w:t xml:space="preserve">suid binary, so I entered the GFTOBins to search for </w:t>
+      </w:r>
+      <w:r>
+        <w:t>an exploit for this nmap version:</w:t>
+      </w:r>
+    </w:p>
+    <w:p>
+      <w:r>
+        <w:drawing>
+          <wp:inline distT="0" distB="0" distL="0" distR="0" wp14:anchorId="38C943D6" wp14:editId="1C3C2A88">
+            <wp:extent cx="3532176" cy="598222"/>
+            <wp:effectExtent l="0" t="0" r="0" b="0"/>
+            <wp:docPr id="393742035" name="תמונה 1"/>
+            <wp:cNvGraphicFramePr>
+              <a:graphicFrameLocks xmlns:a="http://schemas.openxmlformats.org/drawingml/2006/main" noChangeAspect="1"/>
+            </wp:cNvGraphicFramePr>
+            <a:graphic xmlns:a="http://schemas.openxmlformats.org/drawingml/2006/main">
+              <a:graphicData uri="http://schemas.openxmlformats.org/drawingml/2006/picture">
+                <pic:pic xmlns:pic="http://schemas.openxmlformats.org/drawingml/2006/picture">
+                  <pic:nvPicPr>
+                    <pic:cNvPr id="393742035" name=""/>
+                    <pic:cNvPicPr/>
+                  </pic:nvPicPr>
+                  <pic:blipFill>
+                    <a:blip r:embed="rId26"/>
+                    <a:stretch>
+                      <a:fillRect/>
+                    </a:stretch>
+                  </pic:blipFill>
+                  <pic:spPr>
+                    <a:xfrm>
+                      <a:off x="0" y="0"/>
+                      <a:ext cx="3532176" cy="598222"/>
+                    </a:xfrm>
+                    <a:prstGeom prst="rect">
+                      <a:avLst/>
+                    </a:prstGeom>
+                  </pic:spPr>
+                </pic:pic>
+              </a:graphicData>
+            </a:graphic>
+          </wp:inline>
+        </w:drawing>
+      </w:r>
+    </w:p>
+    <w:p>
+      <w:r>
+        <w:t xml:space="preserve">I noticed that </w:t>
+      </w:r>
+      <w:r>
+        <w:t xml:space="preserve">suid </w:t>
+      </w:r>
+      <w:r>
+        <w:t xml:space="preserve">old nmap versions (like 3.81) are vulnerable to </w:t>
+      </w:r>
+      <w:r>
+        <w:t xml:space="preserve">getting escalate privileges using </w:t>
+      </w:r>
+      <w:r>
+        <w:t>the “!sh” command which basically spawn a shell with the privileges of the suid owner.</w:t>
+      </w:r>
+    </w:p>
+    <w:p>
+      <w:r>
+        <w:drawing>
+          <wp:inline distT="0" distB="0" distL="0" distR="0" wp14:anchorId="7BCFF660" wp14:editId="0986E4C6">
+            <wp:extent cx="3742266" cy="1608860"/>
+            <wp:effectExtent l="0" t="0" r="0" b="0"/>
+            <wp:docPr id="215623718" name="תמונה 1"/>
+            <wp:cNvGraphicFramePr>
+              <a:graphicFrameLocks xmlns:a="http://schemas.openxmlformats.org/drawingml/2006/main" noChangeAspect="1"/>
+            </wp:cNvGraphicFramePr>
+            <a:graphic xmlns:a="http://schemas.openxmlformats.org/drawingml/2006/main">
+              <a:graphicData uri="http://schemas.openxmlformats.org/drawingml/2006/picture">
+                <pic:pic xmlns:pic="http://schemas.openxmlformats.org/drawingml/2006/picture">
+                  <pic:nvPicPr>
+                    <pic:cNvPr id="215623718" name=""/>
+                    <pic:cNvPicPr/>
+                  </pic:nvPicPr>
+                  <pic:blipFill>
+                    <a:blip r:embed="rId27"/>
+                    <a:stretch>
+                      <a:fillRect/>
+                    </a:stretch>
+                  </pic:blipFill>
+                  <pic:spPr>
+                    <a:xfrm>
+                      <a:off x="0" y="0"/>
+                      <a:ext cx="3751612" cy="1612878"/>
+                    </a:xfrm>
+                    <a:prstGeom prst="rect">
+                      <a:avLst/>
+                    </a:prstGeom>
+                  </pic:spPr>
+                </pic:pic>
+              </a:graphicData>
+            </a:graphic>
+          </wp:inline>
+        </w:drawing>
+      </w:r>
+    </w:p>
+    <w:p>
+      <w:r>
+        <w:t xml:space="preserve">Now, did it and I found the last key in the </w:t>
+      </w:r>
+      <w:r>
+        <w:t>root directory</w:t>
+      </w:r>
+      <w:r>
+        <w:t xml:space="preserve"> and finished this challenge!!!!</w:t>
+      </w:r>
+      <w:r>
+        <w:rPr>
+          <w:noProof/>
+        </w:rPr>
+        <w:t xml:space="preserve"> </w:t>
+      </w:r>
+      <w:r>
+        <w:rPr>
+          <w:noProof/>
+        </w:rPr>
+        <w:drawing>
+          <wp:inline distT="0" distB="0" distL="0" distR="0" wp14:anchorId="47D5F7A5" wp14:editId="152694D8">
+            <wp:extent cx="5329766" cy="1576984"/>
+            <wp:effectExtent l="0" t="0" r="4445" b="4445"/>
+            <wp:docPr id="285844161" name="תמונה 1" descr="תמונה שמכילה טקסט, צילום מסך, גופן&#10;&#10;תוכן בינה מלאכותית גנרטיבית עשוי להיות שגוי."/>
+            <wp:cNvGraphicFramePr>
+              <a:graphicFrameLocks xmlns:a="http://schemas.openxmlformats.org/drawingml/2006/main" noChangeAspect="1"/>
+            </wp:cNvGraphicFramePr>
+            <a:graphic xmlns:a="http://schemas.openxmlformats.org/drawingml/2006/main">
+              <a:graphicData uri="http://schemas.openxmlformats.org/drawingml/2006/picture">
+                <pic:pic xmlns:pic="http://schemas.openxmlformats.org/drawingml/2006/picture">
+                  <pic:nvPicPr>
+                    <pic:cNvPr id="285844161" name="תמונה 1" descr="תמונה שמכילה טקסט, צילום מסך, גופן&#10;&#10;תוכן בינה מלאכותית גנרטיבית עשוי להיות שגוי."/>
+                    <pic:cNvPicPr/>
+                  </pic:nvPicPr>
+                  <pic:blipFill>
+                    <a:blip r:embed="rId28"/>
+                    <a:stretch>
+                      <a:fillRect/>
+                    </a:stretch>
+                  </pic:blipFill>
+                  <pic:spPr>
+                    <a:xfrm>
+                      <a:off x="0" y="0"/>
+                      <a:ext cx="5334407" cy="1578357"/>
+                    </a:xfrm>
+                    <a:prstGeom prst="rect">
+                      <a:avLst/>
+                    </a:prstGeom>
+                  </pic:spPr>
+                </pic:pic>
+              </a:graphicData>
+            </a:graphic>
+          </wp:inline>
+        </w:drawing>
       </w:r>
     </w:p>
     <w:sectPr>
@@ -2514,6 +3269,7 @@
   <w:style w:type="character" w:default="1" w:styleId="a0">
     <w:name w:val="Default Paragraph Font"/>
     <w:uiPriority w:val="1"/>
+    <w:semiHidden/>
     <w:unhideWhenUsed/>
   </w:style>
   <w:style w:type="table" w:default="1" w:styleId="a1">

</xml_diff>

<commit_message>
Update Mr Robot CTF_Solution_Documentation.docx
</commit_message>
<xml_diff>
--- a/THM_challenges/Medium/Mr Robot CTF/Mr Robot CTF_Solution_Documentation.docx
+++ b/THM_challenges/Medium/Mr Robot CTF/Mr Robot CTF_Solution_Documentation.docx
@@ -1965,6 +1965,9 @@
     </w:p>
     <w:p>
       <w:r>
+        <w:rPr>
+          <w:noProof/>
+        </w:rPr>
         <w:drawing>
           <wp:inline distT="0" distB="0" distL="0" distR="0" wp14:anchorId="61810E62" wp14:editId="247137B3">
             <wp:extent cx="7480300" cy="1573724"/>
@@ -2016,10 +2019,7 @@
     <w:p>
       <w:r>
         <w:lastRenderedPageBreak/>
-        <w:t xml:space="preserve">And in the end, </w:t>
-      </w:r>
-      <w:r>
-        <w:t xml:space="preserve">when I entered the 404.php file using this url “target-ip/404.php” I got </w:t>
+        <w:t xml:space="preserve">And in the end, when I entered the 404.php file using this url “target-ip/404.php” I got </w:t>
       </w:r>
       <w:r>
         <w:t>the targets shell:</w:t>
@@ -2165,6 +2165,9 @@
     </w:p>
     <w:p>
       <w:r>
+        <w:rPr>
+          <w:noProof/>
+        </w:rPr>
         <w:drawing>
           <wp:inline distT="0" distB="0" distL="0" distR="0" wp14:anchorId="23F61964" wp14:editId="3338E3E6">
             <wp:extent cx="5867908" cy="1276461"/>
@@ -2324,6 +2327,9 @@
     </w:p>
     <w:p>
       <w:r>
+        <w:rPr>
+          <w:noProof/>
+        </w:rPr>
         <w:drawing>
           <wp:inline distT="0" distB="0" distL="0" distR="0" wp14:anchorId="258F5CE7" wp14:editId="07EBDCB8">
             <wp:extent cx="4999153" cy="533446"/>
@@ -2445,7 +2451,15 @@
         <w:t xml:space="preserve">so I moved to check </w:t>
       </w:r>
       <w:r>
-        <w:t>any suid binary that I can escalate my privileges by.</w:t>
+        <w:t xml:space="preserve">any </w:t>
+      </w:r>
+      <w:proofErr w:type="spellStart"/>
+      <w:r>
+        <w:t>suid</w:t>
+      </w:r>
+      <w:proofErr w:type="spellEnd"/>
+      <w:r>
+        <w:t xml:space="preserve"> binary that I can escalate my privileges by.</w:t>
       </w:r>
     </w:p>
     <w:p>
@@ -2455,6 +2469,9 @@
     </w:p>
     <w:p>
       <w:r>
+        <w:rPr>
+          <w:noProof/>
+        </w:rPr>
         <w:drawing>
           <wp:inline distT="0" distB="0" distL="0" distR="0" wp14:anchorId="7024066D" wp14:editId="3117793C">
             <wp:extent cx="4439035" cy="2343353"/>
@@ -2494,17 +2511,49 @@
     </w:p>
     <w:p>
       <w:r>
-        <w:t xml:space="preserve">I noticed that there is a nmap </w:t>
-      </w:r>
-      <w:r>
-        <w:t xml:space="preserve">suid binary, so I entered the GFTOBins to search for </w:t>
-      </w:r>
-      <w:r>
-        <w:t>an exploit for this nmap version:</w:t>
-      </w:r>
-    </w:p>
-    <w:p>
-      <w:r>
+        <w:t xml:space="preserve">I noticed that there is a </w:t>
+      </w:r>
+      <w:proofErr w:type="spellStart"/>
+      <w:r>
+        <w:t>nmap</w:t>
+      </w:r>
+      <w:proofErr w:type="spellEnd"/>
+      <w:r>
+        <w:t xml:space="preserve"> </w:t>
+      </w:r>
+      <w:proofErr w:type="spellStart"/>
+      <w:r>
+        <w:t>suid</w:t>
+      </w:r>
+      <w:proofErr w:type="spellEnd"/>
+      <w:r>
+        <w:t xml:space="preserve"> binary, so I entered the </w:t>
+      </w:r>
+      <w:proofErr w:type="spellStart"/>
+      <w:r>
+        <w:t>GFTOBins</w:t>
+      </w:r>
+      <w:proofErr w:type="spellEnd"/>
+      <w:r>
+        <w:t xml:space="preserve"> to search for </w:t>
+      </w:r>
+      <w:r>
+        <w:t xml:space="preserve">an exploit for this </w:t>
+      </w:r>
+      <w:proofErr w:type="spellStart"/>
+      <w:r>
+        <w:t>nmap</w:t>
+      </w:r>
+      <w:proofErr w:type="spellEnd"/>
+      <w:r>
+        <w:t xml:space="preserve"> version:</w:t>
+      </w:r>
+    </w:p>
+    <w:p>
+      <w:r>
+        <w:rPr>
+          <w:noProof/>
+        </w:rPr>
         <w:drawing>
           <wp:inline distT="0" distB="0" distL="0" distR="0" wp14:anchorId="38C943D6" wp14:editId="1C3C2A88">
             <wp:extent cx="3532176" cy="598222"/>
@@ -2546,21 +2595,53 @@
       <w:r>
         <w:t xml:space="preserve">I noticed that </w:t>
       </w:r>
-      <w:r>
-        <w:t xml:space="preserve">suid </w:t>
-      </w:r>
-      <w:r>
-        <w:t xml:space="preserve">old nmap versions (like 3.81) are vulnerable to </w:t>
+      <w:proofErr w:type="spellStart"/>
+      <w:r>
+        <w:t>suid</w:t>
+      </w:r>
+      <w:proofErr w:type="spellEnd"/>
+      <w:r>
+        <w:t xml:space="preserve"> </w:t>
+      </w:r>
+      <w:r>
+        <w:t xml:space="preserve">old </w:t>
+      </w:r>
+      <w:proofErr w:type="spellStart"/>
+      <w:r>
+        <w:t>nmap</w:t>
+      </w:r>
+      <w:proofErr w:type="spellEnd"/>
+      <w:r>
+        <w:t xml:space="preserve"> versions (like 3.81) are vulnerable to </w:t>
       </w:r>
       <w:r>
         <w:t xml:space="preserve">getting escalate privileges using </w:t>
       </w:r>
       <w:r>
-        <w:t>the “!sh” command which basically spawn a shell with the privileges of the suid owner.</w:t>
-      </w:r>
-    </w:p>
-    <w:p>
-      <w:r>
+        <w:t>the “!</w:t>
+      </w:r>
+      <w:proofErr w:type="spellStart"/>
+      <w:r>
+        <w:t>sh</w:t>
+      </w:r>
+      <w:proofErr w:type="spellEnd"/>
+      <w:r>
+        <w:t xml:space="preserve">” command which basically spawn a shell with the privileges of the </w:t>
+      </w:r>
+      <w:proofErr w:type="spellStart"/>
+      <w:r>
+        <w:t>suid</w:t>
+      </w:r>
+      <w:proofErr w:type="spellEnd"/>
+      <w:r>
+        <w:t xml:space="preserve"> owner.</w:t>
+      </w:r>
+    </w:p>
+    <w:p>
+      <w:r>
+        <w:rPr>
+          <w:noProof/>
+        </w:rPr>
         <w:drawing>
           <wp:inline distT="0" distB="0" distL="0" distR="0" wp14:anchorId="7BCFF660" wp14:editId="0986E4C6">
             <wp:extent cx="3742266" cy="1608860"/>
@@ -2600,7 +2681,13 @@
     </w:p>
     <w:p>
       <w:r>
-        <w:t xml:space="preserve">Now, did it and I found the last key in the </w:t>
+        <w:t xml:space="preserve">Now, </w:t>
+      </w:r>
+      <w:r>
+        <w:t>I did</w:t>
+      </w:r>
+      <w:r>
+        <w:t xml:space="preserve"> it and I found the last key in the </w:t>
       </w:r>
       <w:r>
         <w:t>root directory</w:t>

</xml_diff>